<commit_message>
Update resume content to reflect recent roles and responsibilities in backend engineering and data engineering
</commit_message>
<xml_diff>
--- a/assets/resume.docx
+++ b/assets/resume.docx
@@ -267,59 +267,46 @@
         <w:spacing w:after="40"/>
       </w:pPr>
       <w:r>
-        <w:t>Architect end-to-end system designs and technical solutions, translating business requirements into scalable, maintainable backend services</w:t>
-      </w:r>
-    </w:p>
-    <w:p>
-      <w:pPr>
-        <w:pStyle w:val="ListParagraph"/>
-        <w:numPr>
-          <w:ilvl w:val="0"/>
-          <w:numId w:val="2"/>
-        </w:numPr>
-        <w:spacing w:after="40"/>
-      </w:pPr>
-      <w:r>
-        <w:t>Lead full-cycle backend development — from API design and implementation to deployment — while upholding code quality standards and engineering best practices</w:t>
-      </w:r>
-    </w:p>
-    <w:p>
-      <w:pPr>
-        <w:pStyle w:val="ListParagraph"/>
-        <w:numPr>
-          <w:ilvl w:val="0"/>
-          <w:numId w:val="2"/>
-        </w:numPr>
-        <w:spacing w:after="40"/>
-      </w:pPr>
-      <w:r>
-        <w:t>Manage project planning, sprint execution, and delivery timelines; collaborate directly with leadership to align technical roadmap with business objectives</w:t>
-      </w:r>
-    </w:p>
-    <w:p>
-      <w:pPr>
-        <w:pStyle w:val="ListParagraph"/>
-        <w:numPr>
-          <w:ilvl w:val="0"/>
-          <w:numId w:val="2"/>
-        </w:numPr>
-        <w:spacing w:after="40"/>
-      </w:pPr>
-      <w:r>
-        <w:t>Onboard, coach, and mentor new engineers; conduct code reviews and foster a culture of continuous improvement within the team</w:t>
-      </w:r>
-    </w:p>
-    <w:p>
-      <w:pPr>
-        <w:pStyle w:val="ListParagraph"/>
-        <w:numPr>
-          <w:ilvl w:val="0"/>
-          <w:numId w:val="2"/>
-        </w:numPr>
-        <w:spacing w:after="40"/>
-      </w:pPr>
-      <w:r>
-        <w:t>Act as the primary technical advisor for the team, evaluating emerging technologies and resolving complex engineering challenges across projects</w:t>
+        <w:t>Led backend engineering and technical direction; architected scalable systems on Microsoft Azure aligned with business requirements</w:t>
+      </w:r>
+    </w:p>
+    <w:p>
+      <w:pPr>
+        <w:pStyle w:val="ListParagraph"/>
+        <w:numPr>
+          <w:ilvl w:val="0"/>
+          <w:numId w:val="2"/>
+        </w:numPr>
+        <w:spacing w:after="40"/>
+      </w:pPr>
+      <w:r>
+        <w:t>Managed project planning, sprint execution, and delivery timelines; mentored engineers and enforced product quality standards</w:t>
+      </w:r>
+    </w:p>
+    <w:p>
+      <w:pPr>
+        <w:pStyle w:val="ListParagraph"/>
+        <w:numPr>
+          <w:ilvl w:val="0"/>
+          <w:numId w:val="2"/>
+        </w:numPr>
+        <w:spacing w:after="40"/>
+      </w:pPr>
+      <w:r>
+        <w:t>Delivered industrial-grade software for large-scale factory environments in collaboration with data scientists and hardware engineers, with emphasis on stability and fault tolerance</w:t>
+      </w:r>
+    </w:p>
+    <w:p>
+      <w:pPr>
+        <w:pStyle w:val="ListParagraph"/>
+        <w:numPr>
+          <w:ilvl w:val="0"/>
+          <w:numId w:val="2"/>
+        </w:numPr>
+        <w:spacing w:after="40"/>
+      </w:pPr>
+      <w:r>
+        <w:t>Rapidly built and iterated backend services, integrating directly with client-facing systems under tight delivery timelines</w:t>
       </w:r>
     </w:p>
     <w:p>
@@ -364,59 +351,59 @@
         <w:spacing w:after="40"/>
       </w:pPr>
       <w:r>
-        <w:t>Design, build, and maintain robust ETL pipelines and data infrastructure on the Data Platform team, enabling reliable data access for internal users across the organisation</w:t>
-      </w:r>
-    </w:p>
-    <w:p>
-      <w:pPr>
-        <w:pStyle w:val="ListParagraph"/>
-        <w:numPr>
-          <w:ilvl w:val="0"/>
-          <w:numId w:val="2"/>
-        </w:numPr>
-        <w:spacing w:after="40"/>
-      </w:pPr>
-      <w:r>
-        <w:t>Architect and optimise data storage, processing, and integration layers to ensure scalability, performance, and data quality</w:t>
-      </w:r>
-    </w:p>
-    <w:p>
-      <w:pPr>
-        <w:pStyle w:val="ListParagraph"/>
-        <w:numPr>
-          <w:ilvl w:val="0"/>
-          <w:numId w:val="2"/>
-        </w:numPr>
-        <w:spacing w:after="40"/>
-      </w:pPr>
-      <w:r>
-        <w:t>Own full project lifecycle management — defining scope, coordinating team members, tracking milestones, managing risks, and delivering regular progress reports to upper management</w:t>
-      </w:r>
-    </w:p>
-    <w:p>
-      <w:pPr>
-        <w:pStyle w:val="ListParagraph"/>
-        <w:numPr>
-          <w:ilvl w:val="0"/>
-          <w:numId w:val="2"/>
-        </w:numPr>
-        <w:spacing w:after="40"/>
-      </w:pPr>
-      <w:r>
-        <w:t>Serve as the primary liaison between project teams, clients, and leadership; translate business needs into clear technical requirements and ensure alignment throughout delivery</w:t>
-      </w:r>
-    </w:p>
-    <w:p>
-      <w:pPr>
-        <w:pStyle w:val="ListParagraph"/>
-        <w:numPr>
-          <w:ilvl w:val="0"/>
-          <w:numId w:val="2"/>
-        </w:numPr>
-        <w:spacing w:after="40"/>
-      </w:pPr>
-      <w:r>
-        <w:t>Establish and communicate technical and strategic direction for projects, making key architectural decisions and guiding the team toward consistent, high-quality outcomes</w:t>
+        <w:t>Designed and maintained ETL pipelines and data infrastructure, owning full project lifecycle from scope definition to delivery</w:t>
+      </w:r>
+    </w:p>
+    <w:p>
+      <w:pPr>
+        <w:pStyle w:val="ListParagraph"/>
+        <w:numPr>
+          <w:ilvl w:val="0"/>
+          <w:numId w:val="2"/>
+        </w:numPr>
+        <w:spacing w:after="40"/>
+      </w:pPr>
+      <w:r>
+        <w:t>Led cross-functional team to build LLM-powered AI applications; architected AI inference infrastructure using Kubernetes, Ray, and vLLM</w:t>
+      </w:r>
+    </w:p>
+    <w:p>
+      <w:pPr>
+        <w:pStyle w:val="ListParagraph"/>
+        <w:numPr>
+          <w:ilvl w:val="0"/>
+          <w:numId w:val="2"/>
+        </w:numPr>
+        <w:spacing w:after="40"/>
+      </w:pPr>
+      <w:r>
+        <w:t>Implemented a custom RAG system using AlloyDB and custom transformers; worked with team to build multi-agent systems with Google ADK and Vertex AI</w:t>
+      </w:r>
+    </w:p>
+    <w:p>
+      <w:pPr>
+        <w:pStyle w:val="ListParagraph"/>
+        <w:numPr>
+          <w:ilvl w:val="0"/>
+          <w:numId w:val="2"/>
+        </w:numPr>
+        <w:spacing w:after="40"/>
+      </w:pPr>
+      <w:r>
+        <w:t>Managed and optimised cloud infrastructure across AWS and GCP; ensured GDPR compliance across all systems and data practices</w:t>
+      </w:r>
+    </w:p>
+    <w:p>
+      <w:pPr>
+        <w:pStyle w:val="ListParagraph"/>
+        <w:numPr>
+          <w:ilvl w:val="0"/>
+          <w:numId w:val="2"/>
+        </w:numPr>
+        <w:spacing w:after="40"/>
+      </w:pPr>
+      <w:r>
+        <w:t>Acted as primary liaison between clients, engineers, and leadership to align technical execution with business goals</w:t>
       </w:r>
     </w:p>
     <w:p>

</xml_diff>